<commit_message>
Publish the current deployment snapshot for Zeabur sync
This commit captures the current project root state so the GitHub repository matches the local workspace before redeploying on Zeabur.

It includes the updated due diligence demo frontend/backend assets, preview resources, public static files, and local ignore rule cleanup to avoid uploading machine-specific runtime folders.

Constraint: Zeabur deployment pulls from the GitHub repository state
Rejected: Upload .venv and local agent state | machine-specific files should not be versioned
Confidence: high
Scope-risk: moderate
Reversibility: clean
Directive: Keep runtime-only folders ignored so future deployment snapshots stay reviewable
Tested: Verified staged diff and remote configuration before commit
Not-tested: Application runtime on Zeabur after deployment
</commit_message>
<xml_diff>
--- a/智能尽调平台功能文档0507.docx
+++ b/智能尽调平台功能文档0507.docx
@@ -6,6 +6,7 @@
       <w:pPr>
         <w:pStyle w:val="Heading1"/>
         <w:rPr>
+          <w:rFonts w:hint="eastAsia"/>
           <w:sz w:val="30"/>
           <w:szCs w:val="30"/>
         </w:rPr>
@@ -129,7 +130,20 @@
         <w:t>因此，本产品将针对小微企业，进一步设计专项尽调分析板块，帮助银行对该类客户更快准稳地推进信贷审批。</w:t>
       </w:r>
     </w:p>
-    <w:p/>
+    <w:p>
+      <w:pPr>
+        <w:rPr>
+          <w:rFonts w:hint="eastAsia"/>
+        </w:rPr>
+      </w:pPr>
+      <w:r>
+        <w:rPr>
+          <w:rFonts w:hint="eastAsia"/>
+          <w:highlight w:val="yellow"/>
+        </w:rPr>
+        <w:t>银行审批，需要客户经理写尽职调查报告（尽职调查报告助手），小微企业没有抵质押品，财报也不完整</w:t>
+      </w:r>
+    </w:p>
     <w:p>
       <w:pPr>
         <w:pStyle w:val="Heading1"/>
@@ -320,21 +334,28 @@
                 <w:rFonts w:hint="eastAsia"/>
                 <w:szCs w:val="22"/>
               </w:rPr>
-              <w:t>2. 企业主体资格：成立年限、注册资本、实缴情况、行业分类（是否禁入/限制类）、工商状态（是否异常、吊销）。</w:t>
-            </w:r>
-          </w:p>
-          <w:p>
-            <w:pPr>
-              <w:rPr>
-                <w:szCs w:val="22"/>
-              </w:rPr>
-            </w:pPr>
+              <w:t>2. 企业主体资格：成立年限、注册资本、实缴情况、行业分类（是否禁入/限制类）、工商状态（是否异常、吊</w:t>
+            </w:r>
             <w:r>
               <w:rPr>
                 <w:rFonts w:hint="eastAsia"/>
                 <w:szCs w:val="22"/>
               </w:rPr>
               <w:lastRenderedPageBreak/>
+              <w:t>销）。</w:t>
+            </w:r>
+          </w:p>
+          <w:p>
+            <w:pPr>
+              <w:rPr>
+                <w:szCs w:val="22"/>
+              </w:rPr>
+            </w:pPr>
+            <w:r>
+              <w:rPr>
+                <w:rFonts w:hint="eastAsia"/>
+                <w:szCs w:val="22"/>
+              </w:rPr>
               <w:t>3. 法人/股东信息变更：核心人员变更频率，判断经营稳定性。</w:t>
             </w:r>
           </w:p>
@@ -436,7 +457,35 @@
                 <w:szCs w:val="22"/>
               </w:rPr>
               <w:br/>
-              <w:t>5. 公司治理规范性：是否建立“三会一层”并有效运行；董监高稳定性；是否有实际控制人“一言堂”或内部控制人风险。</w:t>
+              <w:t>5. 公司治理规范性：</w:t>
+            </w:r>
+            <w:proofErr w:type="gramStart"/>
+            <w:r>
+              <w:rPr>
+                <w:szCs w:val="22"/>
+              </w:rPr>
+              <w:t>是否建立“三会一层”并有效运行</w:t>
+            </w:r>
+            <w:proofErr w:type="gramEnd"/>
+            <w:r>
+              <w:rPr>
+                <w:szCs w:val="22"/>
+              </w:rPr>
+              <w:t>；董监高稳定性；</w:t>
+            </w:r>
+            <w:proofErr w:type="gramStart"/>
+            <w:r>
+              <w:rPr>
+                <w:szCs w:val="22"/>
+              </w:rPr>
+              <w:t>是否有实际控制人“一言堂”或内部控制人风险</w:t>
+            </w:r>
+            <w:proofErr w:type="gramEnd"/>
+            <w:r>
+              <w:rPr>
+                <w:szCs w:val="22"/>
+              </w:rPr>
+              <w:t>。</w:t>
             </w:r>
           </w:p>
         </w:tc>
@@ -627,7 +676,21 @@
                 <w:szCs w:val="22"/>
               </w:rPr>
               <w:br/>
-              <w:t>• 真实性检验：将报表收入与纳税、用电、物流数据交叉比对，识别“账实不符”或虚增。</w:t>
+              <w:t>• 真实性检验：将报表收入与纳税、用电、物流数据交叉比对，</w:t>
+            </w:r>
+            <w:proofErr w:type="gramStart"/>
+            <w:r>
+              <w:rPr>
+                <w:szCs w:val="22"/>
+              </w:rPr>
+              <w:t>识别“账实不符”或虚增</w:t>
+            </w:r>
+            <w:proofErr w:type="gramEnd"/>
+            <w:r>
+              <w:rPr>
+                <w:szCs w:val="22"/>
+              </w:rPr>
+              <w:t>。</w:t>
             </w:r>
             <w:r>
               <w:rPr>
@@ -648,6 +711,12 @@
                 <w:szCs w:val="22"/>
               </w:rPr>
               <w:br/>
+            </w:r>
+            <w:r>
+              <w:rPr>
+                <w:szCs w:val="22"/>
+              </w:rPr>
+              <w:lastRenderedPageBreak/>
               <w:t>• 经银税互动获取的纳税申报收入。</w:t>
             </w:r>
             <w:r>
@@ -655,12 +724,6 @@
                 <w:szCs w:val="22"/>
               </w:rPr>
               <w:br/>
-            </w:r>
-            <w:r>
-              <w:rPr>
-                <w:szCs w:val="22"/>
-              </w:rPr>
-              <w:lastRenderedPageBreak/>
               <w:t>• 聚合支付（微信/支付宝）商户收单流水。</w:t>
             </w:r>
             <w:r>
@@ -675,7 +738,21 @@
                 <w:szCs w:val="22"/>
               </w:rPr>
               <w:br/>
-              <w:t>3. 经营稳定性（小微企业“活数据”替代）：</w:t>
+              <w:t>3. 经营稳定性（</w:t>
+            </w:r>
+            <w:proofErr w:type="gramStart"/>
+            <w:r>
+              <w:rPr>
+                <w:szCs w:val="22"/>
+              </w:rPr>
+              <w:t>小微企业“活数据”替代</w:t>
+            </w:r>
+            <w:proofErr w:type="gramEnd"/>
+            <w:r>
+              <w:rPr>
+                <w:szCs w:val="22"/>
+              </w:rPr>
+              <w:t>）：</w:t>
             </w:r>
             <w:r>
               <w:rPr>
@@ -751,7 +828,7 @@
                 <w:rFonts w:hint="eastAsia"/>
                 <w:szCs w:val="22"/>
               </w:rPr>
-              <w:t>商业数据：第三方聚合支付服务商（授权商户流水）、电子发票查验平台、供应链金</w:t>
+              <w:t>商业数据：第三方聚合支付服务商（授权商户流水）、电</w:t>
             </w:r>
             <w:r>
               <w:rPr>
@@ -759,7 +836,7 @@
                 <w:szCs w:val="22"/>
               </w:rPr>
               <w:lastRenderedPageBreak/>
-              <w:t>融平台。</w:t>
+              <w:t>子发票查验平台、供应链金融平台。</w:t>
             </w:r>
           </w:p>
         </w:tc>
@@ -1053,14 +1130,13 @@
                 <w:szCs w:val="22"/>
               </w:rPr>
               <w:br/>
-              <w:t>2. 黑名单与关联网络：是否命中金融</w:t>
             </w:r>
             <w:r>
               <w:rPr>
                 <w:szCs w:val="22"/>
               </w:rPr>
               <w:lastRenderedPageBreak/>
-              <w:t>欺诈库、法院失信被执行、电信诈骗等名单；申请手机/设备是否关联历史欺诈团伙</w:t>
+              <w:t>2. 黑名单与关联网络：是否命中金融欺诈库、法院失信被执行、电信诈骗等名单；申请手机/设备是否关联历史欺诈团伙</w:t>
             </w:r>
           </w:p>
         </w:tc>
@@ -1079,19 +1155,20 @@
                 <w:szCs w:val="22"/>
               </w:rPr>
               <w:lastRenderedPageBreak/>
-              <w:t>技术平台：反欺诈SDK（设备指纹）、第三方反欺诈服务商（各类黑名单、风险标签）。</w:t>
+              <w:t>技术平台：反欺诈SDK（设备指纹）、第三方反欺诈服务商（各类黑名单、风险标</w:t>
+            </w:r>
+            <w:r>
+              <w:rPr>
+                <w:szCs w:val="22"/>
+              </w:rPr>
+              <w:lastRenderedPageBreak/>
+              <w:t>签）。</w:t>
             </w:r>
             <w:r>
               <w:rPr>
                 <w:szCs w:val="22"/>
               </w:rPr>
               <w:br/>
-            </w:r>
-            <w:r>
-              <w:rPr>
-                <w:szCs w:val="22"/>
-              </w:rPr>
-              <w:lastRenderedPageBreak/>
               <w:t>司法数据：中国执行信息公开网、司法数据服务商（涉诉、失信、限高信息）。</w:t>
             </w:r>
           </w:p>
@@ -1305,6 +1382,7 @@
       <w:pPr>
         <w:pStyle w:val="Heading1"/>
         <w:rPr>
+          <w:rFonts w:hint="eastAsia"/>
           <w:sz w:val="30"/>
           <w:szCs w:val="30"/>
         </w:rPr>
@@ -1454,6 +1532,7 @@
     </w:p>
     <w:p>
       <w:r>
+        <w:lastRenderedPageBreak/>
         <w:t>宏观环境映射：自动抓取该行业近半年的政策走向</w:t>
       </w:r>
       <w:r>
@@ -1463,11 +1542,7 @@
         <w:t>，</w:t>
       </w:r>
       <w:r>
-        <w:t>判断企业经营是否符合国家导</w:t>
-      </w:r>
-      <w:r>
-        <w:lastRenderedPageBreak/>
-        <w:t>向</w:t>
+        <w:t>判断企业经营是否符合国家导向</w:t>
       </w:r>
       <w:r>
         <w:rPr>
@@ -1484,7 +1559,15 @@
         <w:t>整体竞争格局：通过集中度（</w:t>
       </w:r>
       <w:r>
-        <w:t>行业CR_n（前n名市场占有率）和HHI（赫芬达尔指数）</w:t>
+        <w:t>行业</w:t>
+      </w:r>
+      <w:proofErr w:type="spellStart"/>
+      <w:r>
+        <w:t>CR_n</w:t>
+      </w:r>
+      <w:proofErr w:type="spellEnd"/>
+      <w:r>
+        <w:t>（前n名市场占有率）和HHI（赫芬达尔指数）</w:t>
       </w:r>
       <w:r>
         <w:rPr>
@@ -1750,6 +1833,15 @@
       </w:r>
     </w:p>
     <w:p/>
+    <w:p/>
+    <w:p/>
+    <w:p>
+      <w:pPr>
+        <w:rPr>
+          <w:rFonts w:hint="eastAsia"/>
+        </w:rPr>
+      </w:pPr>
+    </w:p>
     <w:sectPr>
       <w:pgSz w:w="11906" w:h="16838"/>
       <w:pgMar w:top="1440" w:right="1800" w:bottom="1440" w:left="1800" w:header="851" w:footer="992" w:gutter="0"/>

</xml_diff>